<commit_message>
Add JWT authentication with single default admin user
</commit_message>
<xml_diff>
--- a/sample-data/source-documents/Acme_Procurement_Policy.docx
+++ b/sample-data/source-documents/Acme_Procurement_Policy.docx
@@ -4,7 +4,7 @@
   <w:body>
     <w:p>
       <w:pPr>
-        <w:pStyle w:val="Title"/>
+        <w:pStyle w:val="Heading1"/>
       </w:pPr>
       <w:r>
         <w:t>Acme Technologies LLC — Procurement Policy</w:t>
@@ -12,38 +12,12 @@
     </w:p>
     <w:p>
       <w:r>
-        <w:t>NOTICE: Fictional document for software demonstration only; not legal advice.</w:t>
+        <w:t>Fictional document for testing only.</w:t>
       </w:r>
     </w:p>
     <w:p>
       <w:pPr>
-        <w:pStyle w:val="Heading1"/>
-      </w:pPr>
-      <w:r>
-        <w:t>1. Purpose</w:t>
-      </w:r>
-    </w:p>
-    <w:p>
-      <w:r>
-        <w:t>This document outlines standard procurement procedures for internal testing and system demonstration.</w:t>
-      </w:r>
-    </w:p>
-    <w:p>
-      <w:pPr>
-        <w:pStyle w:val="Heading1"/>
-      </w:pPr>
-      <w:r>
-        <w:t>2. Scope</w:t>
-      </w:r>
-    </w:p>
-    <w:p>
-      <w:r>
-        <w:t>Applies to all simulated vendor onboarding and invoice extraction workflows.</w:t>
-      </w:r>
-    </w:p>
-    <w:p>
-      <w:pPr>
-        <w:pStyle w:val="Heading1"/>
+        <w:pStyle w:val="Heading2"/>
       </w:pPr>
       <w:r>
         <w:t>3. Vendor Review</w:t>
@@ -51,33 +25,7 @@
     </w:p>
     <w:p>
       <w:r>
-        <w:t>[FICTIONAL RULE] All vendors must provide verifiable tax identification numbers and clear sanctions screening before onboarding.</w:t>
-      </w:r>
-    </w:p>
-    <w:p>
-      <w:pPr>
-        <w:pStyle w:val="Heading1"/>
-      </w:pPr>
-      <w:r>
-        <w:t>4. Approval</w:t>
-      </w:r>
-    </w:p>
-    <w:p>
-      <w:r>
-        <w:t>[FICTIONAL RULE] Invoices exceeding $10,000 automatically trigger a Human-in-the-Loop review queue.</w:t>
-      </w:r>
-    </w:p>
-    <w:p>
-      <w:pPr>
-        <w:pStyle w:val="Heading1"/>
-      </w:pPr>
-      <w:r>
-        <w:t>5. Recordkeeping</w:t>
-      </w:r>
-    </w:p>
-    <w:p>
-      <w:r>
-        <w:t>All audit logs and transaction states must be archived in PostgreSQL for a minimum of 7 years.</w:t>
+        <w:t>All vendors must complete sanctions screening before engagement. Procurement requests exceeding $10,000 require additional review. Records must be retained for 7 years.</w:t>
       </w:r>
     </w:p>
     <w:sectPr>

</xml_diff>